<commit_message>
docs: update resume link
</commit_message>
<xml_diff>
--- a/sturdy-doodle-documentation.docx
+++ b/sturdy-doodle-documentation.docx
@@ -119,7 +119,7 @@
             <w:rStyle w:val="Hyperlink"/>
             <w:rFonts w:ascii="DejaVu Sans" w:hAnsi="DejaVu Sans"/>
           </w:rPr>
-          <w:t>https://tinyurl.com/mr33a9d6</w:t>
+          <w:t>https://rachmatm.github.io/resume.html</w:t>
         </w:r>
       </w:hyperlink>
     </w:p>
@@ -384,8 +384,8 @@
         </w:tblCellMar>
       </w:tblPr>
       <w:tblGrid>
-        <w:gridCol w:w="359"/>
-        <w:gridCol w:w="2520"/>
+        <w:gridCol w:w="358"/>
+        <w:gridCol w:w="2521"/>
         <w:gridCol w:w="6766"/>
       </w:tblGrid>
       <w:tr>
@@ -394,7 +394,7 @@
         </w:trPr>
         <w:tc>
           <w:tcPr>
-            <w:tcW w:w="359" w:type="dxa"/>
+            <w:tcW w:w="358" w:type="dxa"/>
             <w:tcBorders>
               <w:top w:val="single" w:sz="4" w:space="0" w:color="000000"/>
               <w:left w:val="single" w:sz="4" w:space="0" w:color="000000"/>
@@ -420,7 +420,7 @@
         </w:tc>
         <w:tc>
           <w:tcPr>
-            <w:tcW w:w="2520" w:type="dxa"/>
+            <w:tcW w:w="2521" w:type="dxa"/>
             <w:tcBorders>
               <w:top w:val="single" w:sz="4" w:space="0" w:color="000000"/>
               <w:left w:val="single" w:sz="4" w:space="0" w:color="000000"/>
@@ -476,7 +476,7 @@
         <w:trPr/>
         <w:tc>
           <w:tcPr>
-            <w:tcW w:w="359" w:type="dxa"/>
+            <w:tcW w:w="358" w:type="dxa"/>
             <w:tcBorders>
               <w:left w:val="single" w:sz="4" w:space="0" w:color="000000"/>
               <w:bottom w:val="single" w:sz="4" w:space="0" w:color="000000"/>
@@ -501,7 +501,7 @@
         </w:tc>
         <w:tc>
           <w:tcPr>
-            <w:tcW w:w="2520" w:type="dxa"/>
+            <w:tcW w:w="2521" w:type="dxa"/>
             <w:tcBorders>
               <w:left w:val="single" w:sz="4" w:space="0" w:color="000000"/>
               <w:bottom w:val="single" w:sz="4" w:space="0" w:color="000000"/>
@@ -555,7 +555,7 @@
         <w:trPr/>
         <w:tc>
           <w:tcPr>
-            <w:tcW w:w="359" w:type="dxa"/>
+            <w:tcW w:w="358" w:type="dxa"/>
             <w:tcBorders>
               <w:left w:val="single" w:sz="4" w:space="0" w:color="000000"/>
               <w:bottom w:val="single" w:sz="4" w:space="0" w:color="000000"/>
@@ -580,7 +580,7 @@
         </w:tc>
         <w:tc>
           <w:tcPr>
-            <w:tcW w:w="2520" w:type="dxa"/>
+            <w:tcW w:w="2521" w:type="dxa"/>
             <w:tcBorders>
               <w:left w:val="single" w:sz="4" w:space="0" w:color="000000"/>
               <w:bottom w:val="single" w:sz="4" w:space="0" w:color="000000"/>
@@ -641,7 +641,7 @@
         <w:trPr/>
         <w:tc>
           <w:tcPr>
-            <w:tcW w:w="359" w:type="dxa"/>
+            <w:tcW w:w="358" w:type="dxa"/>
             <w:tcBorders>
               <w:left w:val="single" w:sz="4" w:space="0" w:color="000000"/>
               <w:bottom w:val="single" w:sz="4" w:space="0" w:color="000000"/>
@@ -666,7 +666,7 @@
         </w:tc>
         <w:tc>
           <w:tcPr>
-            <w:tcW w:w="2520" w:type="dxa"/>
+            <w:tcW w:w="2521" w:type="dxa"/>
             <w:tcBorders>
               <w:left w:val="single" w:sz="4" w:space="0" w:color="000000"/>
               <w:bottom w:val="single" w:sz="4" w:space="0" w:color="000000"/>
@@ -720,7 +720,7 @@
         <w:trPr/>
         <w:tc>
           <w:tcPr>
-            <w:tcW w:w="359" w:type="dxa"/>
+            <w:tcW w:w="358" w:type="dxa"/>
             <w:tcBorders>
               <w:left w:val="single" w:sz="4" w:space="0" w:color="000000"/>
               <w:bottom w:val="single" w:sz="4" w:space="0" w:color="000000"/>
@@ -745,7 +745,7 @@
         </w:tc>
         <w:tc>
           <w:tcPr>
-            <w:tcW w:w="2520" w:type="dxa"/>
+            <w:tcW w:w="2521" w:type="dxa"/>
             <w:tcBorders>
               <w:left w:val="single" w:sz="4" w:space="0" w:color="000000"/>
               <w:bottom w:val="single" w:sz="4" w:space="0" w:color="000000"/>
@@ -799,7 +799,7 @@
         <w:trPr/>
         <w:tc>
           <w:tcPr>
-            <w:tcW w:w="359" w:type="dxa"/>
+            <w:tcW w:w="358" w:type="dxa"/>
             <w:tcBorders>
               <w:left w:val="single" w:sz="4" w:space="0" w:color="000000"/>
               <w:bottom w:val="single" w:sz="4" w:space="0" w:color="000000"/>
@@ -824,7 +824,7 @@
         </w:tc>
         <w:tc>
           <w:tcPr>
-            <w:tcW w:w="2520" w:type="dxa"/>
+            <w:tcW w:w="2521" w:type="dxa"/>
             <w:tcBorders>
               <w:left w:val="single" w:sz="4" w:space="0" w:color="000000"/>
               <w:bottom w:val="single" w:sz="4" w:space="0" w:color="000000"/>
@@ -878,7 +878,7 @@
         <w:trPr/>
         <w:tc>
           <w:tcPr>
-            <w:tcW w:w="359" w:type="dxa"/>
+            <w:tcW w:w="358" w:type="dxa"/>
             <w:tcBorders>
               <w:left w:val="single" w:sz="4" w:space="0" w:color="000000"/>
               <w:bottom w:val="single" w:sz="4" w:space="0" w:color="000000"/>
@@ -903,7 +903,7 @@
         </w:tc>
         <w:tc>
           <w:tcPr>
-            <w:tcW w:w="2520" w:type="dxa"/>
+            <w:tcW w:w="2521" w:type="dxa"/>
             <w:tcBorders>
               <w:left w:val="single" w:sz="4" w:space="0" w:color="000000"/>
               <w:bottom w:val="single" w:sz="4" w:space="0" w:color="000000"/>

</xml_diff>

<commit_message>
docs: add my resume link to the documentation
</commit_message>
<xml_diff>
--- a/sturdy-doodle-documentation.docx
+++ b/sturdy-doodle-documentation.docx
@@ -119,7 +119,7 @@
             <w:rStyle w:val="Hyperlink"/>
             <w:rFonts w:ascii="DejaVu Sans" w:hAnsi="DejaVu Sans"/>
           </w:rPr>
-          <w:t>https://rachmatm.github.io/resume.html</w:t>
+          <w:t>https://rachmatm.github.io</w:t>
         </w:r>
       </w:hyperlink>
     </w:p>
@@ -384,8 +384,8 @@
         </w:tblCellMar>
       </w:tblPr>
       <w:tblGrid>
-        <w:gridCol w:w="358"/>
-        <w:gridCol w:w="2521"/>
+        <w:gridCol w:w="357"/>
+        <w:gridCol w:w="2522"/>
         <w:gridCol w:w="6766"/>
       </w:tblGrid>
       <w:tr>
@@ -394,7 +394,7 @@
         </w:trPr>
         <w:tc>
           <w:tcPr>
-            <w:tcW w:w="358" w:type="dxa"/>
+            <w:tcW w:w="357" w:type="dxa"/>
             <w:tcBorders>
               <w:top w:val="single" w:sz="4" w:space="0" w:color="000000"/>
               <w:left w:val="single" w:sz="4" w:space="0" w:color="000000"/>
@@ -420,7 +420,7 @@
         </w:tc>
         <w:tc>
           <w:tcPr>
-            <w:tcW w:w="2521" w:type="dxa"/>
+            <w:tcW w:w="2522" w:type="dxa"/>
             <w:tcBorders>
               <w:top w:val="single" w:sz="4" w:space="0" w:color="000000"/>
               <w:left w:val="single" w:sz="4" w:space="0" w:color="000000"/>
@@ -476,7 +476,7 @@
         <w:trPr/>
         <w:tc>
           <w:tcPr>
-            <w:tcW w:w="358" w:type="dxa"/>
+            <w:tcW w:w="357" w:type="dxa"/>
             <w:tcBorders>
               <w:left w:val="single" w:sz="4" w:space="0" w:color="000000"/>
               <w:bottom w:val="single" w:sz="4" w:space="0" w:color="000000"/>
@@ -501,7 +501,7 @@
         </w:tc>
         <w:tc>
           <w:tcPr>
-            <w:tcW w:w="2521" w:type="dxa"/>
+            <w:tcW w:w="2522" w:type="dxa"/>
             <w:tcBorders>
               <w:left w:val="single" w:sz="4" w:space="0" w:color="000000"/>
               <w:bottom w:val="single" w:sz="4" w:space="0" w:color="000000"/>
@@ -555,7 +555,7 @@
         <w:trPr/>
         <w:tc>
           <w:tcPr>
-            <w:tcW w:w="358" w:type="dxa"/>
+            <w:tcW w:w="357" w:type="dxa"/>
             <w:tcBorders>
               <w:left w:val="single" w:sz="4" w:space="0" w:color="000000"/>
               <w:bottom w:val="single" w:sz="4" w:space="0" w:color="000000"/>
@@ -580,7 +580,7 @@
         </w:tc>
         <w:tc>
           <w:tcPr>
-            <w:tcW w:w="2521" w:type="dxa"/>
+            <w:tcW w:w="2522" w:type="dxa"/>
             <w:tcBorders>
               <w:left w:val="single" w:sz="4" w:space="0" w:color="000000"/>
               <w:bottom w:val="single" w:sz="4" w:space="0" w:color="000000"/>
@@ -641,7 +641,7 @@
         <w:trPr/>
         <w:tc>
           <w:tcPr>
-            <w:tcW w:w="358" w:type="dxa"/>
+            <w:tcW w:w="357" w:type="dxa"/>
             <w:tcBorders>
               <w:left w:val="single" w:sz="4" w:space="0" w:color="000000"/>
               <w:bottom w:val="single" w:sz="4" w:space="0" w:color="000000"/>
@@ -666,7 +666,7 @@
         </w:tc>
         <w:tc>
           <w:tcPr>
-            <w:tcW w:w="2521" w:type="dxa"/>
+            <w:tcW w:w="2522" w:type="dxa"/>
             <w:tcBorders>
               <w:left w:val="single" w:sz="4" w:space="0" w:color="000000"/>
               <w:bottom w:val="single" w:sz="4" w:space="0" w:color="000000"/>
@@ -720,7 +720,7 @@
         <w:trPr/>
         <w:tc>
           <w:tcPr>
-            <w:tcW w:w="358" w:type="dxa"/>
+            <w:tcW w:w="357" w:type="dxa"/>
             <w:tcBorders>
               <w:left w:val="single" w:sz="4" w:space="0" w:color="000000"/>
               <w:bottom w:val="single" w:sz="4" w:space="0" w:color="000000"/>
@@ -745,7 +745,7 @@
         </w:tc>
         <w:tc>
           <w:tcPr>
-            <w:tcW w:w="2521" w:type="dxa"/>
+            <w:tcW w:w="2522" w:type="dxa"/>
             <w:tcBorders>
               <w:left w:val="single" w:sz="4" w:space="0" w:color="000000"/>
               <w:bottom w:val="single" w:sz="4" w:space="0" w:color="000000"/>
@@ -799,7 +799,7 @@
         <w:trPr/>
         <w:tc>
           <w:tcPr>
-            <w:tcW w:w="358" w:type="dxa"/>
+            <w:tcW w:w="357" w:type="dxa"/>
             <w:tcBorders>
               <w:left w:val="single" w:sz="4" w:space="0" w:color="000000"/>
               <w:bottom w:val="single" w:sz="4" w:space="0" w:color="000000"/>
@@ -824,7 +824,7 @@
         </w:tc>
         <w:tc>
           <w:tcPr>
-            <w:tcW w:w="2521" w:type="dxa"/>
+            <w:tcW w:w="2522" w:type="dxa"/>
             <w:tcBorders>
               <w:left w:val="single" w:sz="4" w:space="0" w:color="000000"/>
               <w:bottom w:val="single" w:sz="4" w:space="0" w:color="000000"/>
@@ -878,7 +878,7 @@
         <w:trPr/>
         <w:tc>
           <w:tcPr>
-            <w:tcW w:w="358" w:type="dxa"/>
+            <w:tcW w:w="357" w:type="dxa"/>
             <w:tcBorders>
               <w:left w:val="single" w:sz="4" w:space="0" w:color="000000"/>
               <w:bottom w:val="single" w:sz="4" w:space="0" w:color="000000"/>
@@ -903,7 +903,7 @@
         </w:tc>
         <w:tc>
           <w:tcPr>
-            <w:tcW w:w="2521" w:type="dxa"/>
+            <w:tcW w:w="2522" w:type="dxa"/>
             <w:tcBorders>
               <w:left w:val="single" w:sz="4" w:space="0" w:color="000000"/>
               <w:bottom w:val="single" w:sz="4" w:space="0" w:color="000000"/>

</xml_diff>